<commit_message>
feat(reports): upgrade research utils to 0.16.0 and use Noto Sans and Noto Sans Math throughout (#694)
Co-authored-by: Claude Opus 5.5 <noreply@anthropic.com>
</commit_message>
<xml_diff>
--- a/docs/template.docx
+++ b/docs/template.docx
@@ -1583,14 +1583,14 @@
         <a:srgbClr val="96607D"/>
       </a:folHlink>
     </a:clrScheme>
-    <a:fontScheme name="Source Sans">
+    <a:fontScheme name="Noto Sans">
       <a:majorFont>
-        <a:latin typeface="Source Sans 3"/>
+        <a:latin typeface="Noto Sans"/>
         <a:ea typeface=""/>
         <a:cs typeface=""/>
       </a:majorFont>
       <a:minorFont>
-        <a:latin typeface="Source Sans 3"/>
+        <a:latin typeface="Noto Sans"/>
         <a:ea typeface=""/>
         <a:cs typeface=""/>
       </a:minorFont>

</xml_diff>